<commit_message>
1. feladat: az idő a szimulációs sávról, a pályahossz számítással
A RoboDK a csúszka mellett csak a program idejét írja ki (pl. "PP_MoveJ_lassu time: 11.6s",
egy tizedesre kerekítve); a mellette álló szám (pl. 529) a szimuláció lépésszáma, nem az út.

- Útmutató: a mérési szabályok, az M1/M2 lépések, a 15. és 18. lépés ellenőrzése és a
  hibaelhárítás ehhez igazítva; a pályahossz számítással (MoveL: egyenesek, MoveJ: körív).
- A RoboDK-ablak vázlatán a szimulációs sáv a valódi elrendezést mutatja.
- Word-sablon: mérési módszer (0,1 s felbontás), T1.1/T1.2 pályahossz-oszlop számítottként,
  11. ábra a szimulációs sávról.

Co-Authored-By: Claude Opus 5.5 <noreply@anthropic.com>
Claude-Session: https://claude.ai/code/session_013Dj5e1HJ6gpyba1zYkCZji
</commit_message>
<xml_diff>
--- a/feladat1/jegyzokonyv_sablon.docx
+++ b/feladat1/jegyzokonyv_sablon.docx
@@ -666,10 +666,25 @@
         <w:rPr>
           <w:b/>
         </w:rPr>
-        <w:t xml:space="preserve">Ciklusidő és pályahossz: </w:t>
+        <w:t xml:space="preserve">Ciklusidő: </w:t>
       </w:r>
       <w:r>
-        <w:t>a program lefutása után a RoboDK állapotsorában kiírt becsült programidő és pályahossz. A program indítása előtt a robotot a program első célpontjába állítottam, és minden programot kétszer futtattam; a második futás eredményét rögzítettem.</w:t>
+        <w:t>a program lefutása után a RoboDK szimulációs sávján, a program neve mellett kiírt becsült programidő (például „PP_MoveJ_lassu time: 11.6s”). A RoboDK ezt egy tizedesre kerekítve írja ki, ezért a leolvasás felbontása 0,1 s. A program indítása előtt a robotot a program első célpontjába állítottam, és minden programot kétszer futtattam; a második futás eredményét rögzítettem.</w:t>
+      </w:r>
+    </w:p>
+    <w:p>
+      <w:pPr>
+        <w:pStyle w:val="ListBullet"/>
+        <w:spacing w:after="40"/>
+      </w:pPr>
+      <w:r>
+        <w:rPr>
+          <w:b/>
+        </w:rPr>
+        <w:t xml:space="preserve">Pályahossz: </w:t>
+      </w:r>
+      <w:r>
+        <w:t>számítással, a célpontok koordinátáiból és a leolvasott csuklószögekből (MoveL: egyenes szakaszok; MoveJ-átvitel: körív a robot talpa körül), mert a RoboDK a szimulációs sávon csak az időt írja ki.</w:t>
       </w:r>
     </w:p>
     <w:p>
@@ -5219,7 +5234,7 @@
           <w:b w:val="0"/>
           <w:i/>
         </w:rPr>
-        <w:t>A halványsárga cellák a mért, illetve számított értékek helyei. Az időket és a pályahosszokat a RoboDK állapotsorából olvastam le (minden program második futásából).</w:t>
+        <w:t>A halványsárga cellák a mért, illetve számított értékek helyei. Az időket a RoboDK szimulációs sávjáról olvastam le, minden program második futásából (felbontás: 0,1 s). A pályahosszak számított értékek (1.3).</w:t>
       </w:r>
     </w:p>
     <w:p>
@@ -5386,7 +5401,7 @@
                 <w:b/>
                 <w:sz w:val="19"/>
               </w:rPr>
-              <w:t>Mért pályahossz [mm]</w:t>
+              <w:t>Pályahossz [mm] (számított)</w:t>
             </w:r>
           </w:p>
         </w:tc>
@@ -6115,7 +6130,7 @@
         <w:rPr>
           <w:highlight w:val="yellow"/>
         </w:rPr>
-        <w:t>[Ide illeszd be a képernyőképet: az állapotsor egy program lefutása után]</w:t>
+        <w:t>[Ide illeszd be a képernyőképet: a szimulációs sáv a program végén (a program neve és ideje)]</w:t>
       </w:r>
     </w:p>
     <w:p>
@@ -6128,7 +6143,7 @@
           <w:b w:val="0"/>
           <w:i w:val="0"/>
         </w:rPr>
-        <w:t>11. ábra – Az állapotsor a PP_MoveJ_kozepes program végén</w:t>
+        <w:t>11. ábra – A szimulációs sáv a PP_MoveJ_kozepes program végén</w:t>
       </w:r>
     </w:p>
     <w:p>
@@ -6304,7 +6319,7 @@
                 <w:b/>
                 <w:sz w:val="19"/>
               </w:rPr>
-              <w:t>Mért út [mm]</w:t>
+              <w:t>Út [mm] (számított)</w:t>
             </w:r>
           </w:p>
         </w:tc>
@@ -7025,16 +7040,11 @@
     </w:p>
     <w:p>
       <w:r>
-        <w:t xml:space="preserve">A MoveL-út számítással: 100 + 400 + 100 = 600 mm (emelés, átvitel, leengedés). Mért: </w:t>
-      </w:r>
-      <w:r>
         <w:rPr>
-          <w:highlight w:val="yellow"/>
+          <w:b w:val="0"/>
+          <w:i w:val="0"/>
         </w:rPr>
-        <w:t>[…]</w:t>
-      </w:r>
-      <w:r>
-        <w:t xml:space="preserve"> mm.</w:t>
+        <w:t>A MoveL-út számítással: 100 + 400 + 100 = 600 mm (emelés, átvitel, leengedés).</w:t>
       </w:r>
     </w:p>
     <w:p>
@@ -7057,7 +7067,7 @@
         <w:t>[…]</w:t>
       </w:r>
       <w:r>
-        <w:t xml:space="preserve"> mm. Számítva: 100 + </w:t>
+        <w:t xml:space="preserve"> mm. A teljes út: 100 + </w:t>
       </w:r>
       <w:r>
         <w:rPr>
@@ -7067,15 +7077,6 @@
       </w:r>
       <w:r>
         <w:t xml:space="preserve"> + 100 = </w:t>
-      </w:r>
-      <w:r>
-        <w:rPr>
-          <w:highlight w:val="yellow"/>
-        </w:rPr>
-        <w:t>[…]</w:t>
-      </w:r>
-      <w:r>
-        <w:t xml:space="preserve"> mm; mért: </w:t>
       </w:r>
       <w:r>
         <w:rPr>

</xml_diff>